<commit_message>
Update Assignment 4 submission document
Update the Assignment 4 submission document with the latest 4-bit up/down counter implementation material, reset variants, and simulation evidence.
</commit_message>
<xml_diff>
--- a/DAY2/Assignment 4/Assignment 4.docx
+++ b/DAY2/Assignment 4/Assignment 4.docx
@@ -23,6 +23,53 @@
           <w:b/>
           <w:bCs/>
         </w:rPr>
+        <w:t xml:space="preserve">GitHub Link : </w:t>
+      </w:r>
+      <w:hyperlink r:id="rId5" w:history="1">
+        <w:r>
+          <w:rPr>
+            <w:rStyle w:val="Hyperlink"/>
+          </w:rPr>
+          <w:t>https://github.com/ssbagi/IBM_OpenPOWER_and_SoC_Design/tree/main/DAY2/Assignment%204</w:t>
+        </w:r>
+      </w:hyperlink>
+      <w:r>
+        <w:rPr>
+          <w:b/>
+          <w:bCs/>
+        </w:rPr>
+        <w:t xml:space="preserve"> </w:t>
+      </w:r>
+    </w:p>
+    <w:p>
+      <w:r>
+        <w:rPr>
+          <w:b/>
+          <w:bCs/>
+        </w:rPr>
+        <w:t>README.md File</w:t>
+      </w:r>
+      <w:r>
+        <w:t xml:space="preserve"> : </w:t>
+      </w:r>
+      <w:hyperlink r:id="rId6" w:history="1">
+        <w:r>
+          <w:rPr>
+            <w:rStyle w:val="Hyperlink"/>
+          </w:rPr>
+          <w:t>https://github.com/ssbagi/IBM_OpenPOWER_and_SoC_Design/blob/main/DAY2/Assignment%204/README.md</w:t>
+        </w:r>
+      </w:hyperlink>
+      <w:r>
+        <w:t xml:space="preserve"> </w:t>
+      </w:r>
+    </w:p>
+    <w:p>
+      <w:r>
+        <w:rPr>
+          <w:b/>
+          <w:bCs/>
+        </w:rPr>
         <w:t>Question :</w:t>
       </w:r>
       <w:r>
@@ -72,6 +119,11 @@
     <w:p/>
     <w:p>
       <w:pPr>
+        <w:pStyle w:val="ListParagraph"/>
+        <w:numPr>
+          <w:ilvl w:val="0"/>
+          <w:numId w:val="1"/>
+        </w:numPr>
         <w:rPr>
           <w:b/>
           <w:bCs/>
@@ -92,7 +144,445 @@
         <w:t xml:space="preserve"> : </w:t>
       </w:r>
     </w:p>
+    <w:p>
+      <w:r>
+        <w:t>module up_down_counter_4_bit (</w:t>
+      </w:r>
+    </w:p>
+    <w:p>
+      <w:r>
+        <w:t xml:space="preserve">    input            clk,</w:t>
+      </w:r>
+    </w:p>
+    <w:p>
+      <w:r>
+        <w:t xml:space="preserve">    input            reset,</w:t>
+      </w:r>
+    </w:p>
+    <w:p>
+      <w:r>
+        <w:t xml:space="preserve">    input            up,</w:t>
+      </w:r>
+    </w:p>
+    <w:p>
+      <w:r>
+        <w:t xml:space="preserve">    output reg [3:0] count</w:t>
+      </w:r>
+    </w:p>
+    <w:p>
+      <w:r>
+        <w:t>);</w:t>
+      </w:r>
+    </w:p>
+    <w:p>
+      <w:r>
+        <w:t xml:space="preserve">    always @(posedge clk) begin</w:t>
+      </w:r>
+    </w:p>
+    <w:p>
+      <w:r>
+        <w:t xml:space="preserve">        if (reset)</w:t>
+      </w:r>
+    </w:p>
+    <w:p>
+      <w:r>
+        <w:t xml:space="preserve">            count &lt;= 4'b0000;</w:t>
+      </w:r>
+    </w:p>
+    <w:p>
+      <w:r>
+        <w:t xml:space="preserve">        else if (up)</w:t>
+      </w:r>
+    </w:p>
+    <w:p>
+      <w:r>
+        <w:t xml:space="preserve">            count &lt;= count + 4'b0001;</w:t>
+      </w:r>
+    </w:p>
+    <w:p>
+      <w:r>
+        <w:t xml:space="preserve">        else</w:t>
+      </w:r>
+    </w:p>
+    <w:p>
+      <w:r>
+        <w:t xml:space="preserve">            count &lt;= count - 4'b0001;</w:t>
+      </w:r>
+    </w:p>
+    <w:p>
+      <w:r>
+        <w:t xml:space="preserve">    end</w:t>
+      </w:r>
+    </w:p>
+    <w:p>
+      <w:r>
+        <w:lastRenderedPageBreak/>
+        <w:t>endmodule</w:t>
+      </w:r>
+    </w:p>
     <w:p/>
+    <w:p/>
+    <w:p/>
+    <w:p/>
+    <w:p>
+      <w:pPr>
+        <w:pStyle w:val="ListParagraph"/>
+        <w:numPr>
+          <w:ilvl w:val="0"/>
+          <w:numId w:val="1"/>
+        </w:numPr>
+      </w:pPr>
+      <w:r>
+        <w:rPr>
+          <w:b/>
+          <w:bCs/>
+        </w:rPr>
+        <w:t>Synchronous reset implementati</w:t>
+      </w:r>
+      <w:r>
+        <w:rPr>
+          <w:b/>
+          <w:bCs/>
+        </w:rPr>
+        <w:t xml:space="preserve">on : </w:t>
+      </w:r>
+    </w:p>
+    <w:p>
+      <w:pPr>
+        <w:pStyle w:val="ListParagraph"/>
+      </w:pPr>
+    </w:p>
+    <w:p>
+      <w:pPr>
+        <w:pStyle w:val="ListParagraph"/>
+        <w:rPr>
+          <w:b/>
+          <w:bCs/>
+        </w:rPr>
+      </w:pPr>
+      <w:r>
+        <w:rPr>
+          <w:b/>
+          <w:bCs/>
+        </w:rPr>
+        <w:t>Verilog code :</w:t>
+      </w:r>
+    </w:p>
+    <w:p>
+      <w:pPr>
+        <w:pStyle w:val="ListParagraph"/>
+      </w:pPr>
+      <w:r>
+        <w:t>module up_down_counter_4_bit (</w:t>
+      </w:r>
+    </w:p>
+    <w:p>
+      <w:pPr>
+        <w:pStyle w:val="ListParagraph"/>
+      </w:pPr>
+      <w:r>
+        <w:t>    input            clk,</w:t>
+      </w:r>
+    </w:p>
+    <w:p>
+      <w:pPr>
+        <w:pStyle w:val="ListParagraph"/>
+      </w:pPr>
+      <w:r>
+        <w:t>    input            reset,</w:t>
+      </w:r>
+    </w:p>
+    <w:p>
+      <w:pPr>
+        <w:pStyle w:val="ListParagraph"/>
+      </w:pPr>
+      <w:r>
+        <w:t>    input            up,</w:t>
+      </w:r>
+    </w:p>
+    <w:p>
+      <w:pPr>
+        <w:pStyle w:val="ListParagraph"/>
+      </w:pPr>
+      <w:r>
+        <w:t>    output reg [3:0] count</w:t>
+      </w:r>
+    </w:p>
+    <w:p>
+      <w:pPr>
+        <w:pStyle w:val="ListParagraph"/>
+      </w:pPr>
+      <w:r>
+        <w:t>);</w:t>
+      </w:r>
+    </w:p>
+    <w:p>
+      <w:pPr>
+        <w:pStyle w:val="ListParagraph"/>
+      </w:pPr>
+    </w:p>
+    <w:p>
+      <w:pPr>
+        <w:pStyle w:val="ListParagraph"/>
+      </w:pPr>
+      <w:r>
+        <w:t>    always @(posedge clk) begin</w:t>
+      </w:r>
+    </w:p>
+    <w:p>
+      <w:pPr>
+        <w:pStyle w:val="ListParagraph"/>
+      </w:pPr>
+      <w:r>
+        <w:t>        if (reset)</w:t>
+      </w:r>
+    </w:p>
+    <w:p>
+      <w:pPr>
+        <w:pStyle w:val="ListParagraph"/>
+      </w:pPr>
+      <w:r>
+        <w:t>            count &lt;= 4'b0000;</w:t>
+      </w:r>
+    </w:p>
+    <w:p>
+      <w:pPr>
+        <w:pStyle w:val="ListParagraph"/>
+      </w:pPr>
+      <w:r>
+        <w:t>        else if (up)</w:t>
+      </w:r>
+    </w:p>
+    <w:p>
+      <w:pPr>
+        <w:pStyle w:val="ListParagraph"/>
+      </w:pPr>
+      <w:r>
+        <w:t>            count &lt;= count + 4'b0001;</w:t>
+      </w:r>
+    </w:p>
+    <w:p>
+      <w:pPr>
+        <w:pStyle w:val="ListParagraph"/>
+      </w:pPr>
+      <w:r>
+        <w:t>        else</w:t>
+      </w:r>
+    </w:p>
+    <w:p>
+      <w:pPr>
+        <w:pStyle w:val="ListParagraph"/>
+      </w:pPr>
+      <w:r>
+        <w:t>            count &lt;= count - 4'b0001;</w:t>
+      </w:r>
+    </w:p>
+    <w:p>
+      <w:pPr>
+        <w:pStyle w:val="ListParagraph"/>
+      </w:pPr>
+      <w:r>
+        <w:t>    end</w:t>
+      </w:r>
+    </w:p>
+    <w:p>
+      <w:pPr>
+        <w:pStyle w:val="ListParagraph"/>
+      </w:pPr>
+    </w:p>
+    <w:p>
+      <w:pPr>
+        <w:pStyle w:val="ListParagraph"/>
+      </w:pPr>
+      <w:r>
+        <w:t>endmodule</w:t>
+      </w:r>
+    </w:p>
+    <w:p>
+      <w:pPr>
+        <w:pStyle w:val="ListParagraph"/>
+      </w:pPr>
+    </w:p>
+    <w:p>
+      <w:pPr>
+        <w:pStyle w:val="ListParagraph"/>
+      </w:pPr>
+    </w:p>
+    <w:p>
+      <w:pPr>
+        <w:pStyle w:val="ListParagraph"/>
+      </w:pPr>
+    </w:p>
+    <w:p>
+      <w:pPr>
+        <w:pStyle w:val="ListParagraph"/>
+        <w:numPr>
+          <w:ilvl w:val="0"/>
+          <w:numId w:val="1"/>
+        </w:numPr>
+      </w:pPr>
+      <w:r>
+        <w:rPr>
+          <w:b/>
+          <w:bCs/>
+        </w:rPr>
+        <w:t>Asynchronous reset implementati</w:t>
+      </w:r>
+      <w:r>
+        <w:rPr>
+          <w:b/>
+          <w:bCs/>
+        </w:rPr>
+        <w:t xml:space="preserve">on : </w:t>
+      </w:r>
+    </w:p>
+    <w:p>
+      <w:pPr>
+        <w:pStyle w:val="ListParagraph"/>
+        <w:rPr>
+          <w:b/>
+          <w:bCs/>
+        </w:rPr>
+      </w:pPr>
+      <w:r>
+        <w:rPr>
+          <w:b/>
+          <w:bCs/>
+        </w:rPr>
+        <w:t>Verilog code :</w:t>
+      </w:r>
+    </w:p>
+    <w:p>
+      <w:pPr>
+        <w:pStyle w:val="ListParagraph"/>
+      </w:pPr>
+      <w:r>
+        <w:t>module up_down_counter_asynchronous_reset (</w:t>
+      </w:r>
+    </w:p>
+    <w:p>
+      <w:pPr>
+        <w:pStyle w:val="ListParagraph"/>
+      </w:pPr>
+      <w:r>
+        <w:t xml:space="preserve">    input            clk,</w:t>
+      </w:r>
+    </w:p>
+    <w:p>
+      <w:pPr>
+        <w:pStyle w:val="ListParagraph"/>
+      </w:pPr>
+      <w:r>
+        <w:t xml:space="preserve">    input            reset,</w:t>
+      </w:r>
+    </w:p>
+    <w:p>
+      <w:pPr>
+        <w:pStyle w:val="ListParagraph"/>
+      </w:pPr>
+      <w:r>
+        <w:t xml:space="preserve">    input            up,</w:t>
+      </w:r>
+    </w:p>
+    <w:p>
+      <w:pPr>
+        <w:pStyle w:val="ListParagraph"/>
+      </w:pPr>
+      <w:r>
+        <w:t xml:space="preserve">    output reg [3:0] count</w:t>
+      </w:r>
+    </w:p>
+    <w:p>
+      <w:pPr>
+        <w:pStyle w:val="ListParagraph"/>
+      </w:pPr>
+      <w:r>
+        <w:t>);</w:t>
+      </w:r>
+    </w:p>
+    <w:p>
+      <w:pPr>
+        <w:pStyle w:val="ListParagraph"/>
+      </w:pPr>
+      <w:r>
+        <w:t xml:space="preserve">    always @(posedge clk or posedge reset) begin</w:t>
+      </w:r>
+    </w:p>
+    <w:p>
+      <w:pPr>
+        <w:pStyle w:val="ListParagraph"/>
+      </w:pPr>
+      <w:r>
+        <w:t xml:space="preserve">        if (reset)</w:t>
+      </w:r>
+    </w:p>
+    <w:p>
+      <w:pPr>
+        <w:pStyle w:val="ListParagraph"/>
+      </w:pPr>
+      <w:r>
+        <w:lastRenderedPageBreak/>
+        <w:t xml:space="preserve">            count &lt;= 4'b0000;</w:t>
+      </w:r>
+    </w:p>
+    <w:p>
+      <w:pPr>
+        <w:pStyle w:val="ListParagraph"/>
+      </w:pPr>
+      <w:r>
+        <w:t xml:space="preserve">        else if (up)</w:t>
+      </w:r>
+    </w:p>
+    <w:p>
+      <w:pPr>
+        <w:pStyle w:val="ListParagraph"/>
+      </w:pPr>
+      <w:r>
+        <w:t xml:space="preserve">            count &lt;= count + 4'b0001;</w:t>
+      </w:r>
+    </w:p>
+    <w:p>
+      <w:pPr>
+        <w:pStyle w:val="ListParagraph"/>
+      </w:pPr>
+      <w:r>
+        <w:t xml:space="preserve">        else</w:t>
+      </w:r>
+    </w:p>
+    <w:p>
+      <w:pPr>
+        <w:pStyle w:val="ListParagraph"/>
+      </w:pPr>
+      <w:r>
+        <w:t xml:space="preserve">            count &lt;= count - 4'b0001;</w:t>
+      </w:r>
+    </w:p>
+    <w:p>
+      <w:pPr>
+        <w:pStyle w:val="ListParagraph"/>
+      </w:pPr>
+      <w:r>
+        <w:t xml:space="preserve">    end</w:t>
+      </w:r>
+    </w:p>
+    <w:p>
+      <w:pPr>
+        <w:pStyle w:val="ListParagraph"/>
+      </w:pPr>
+      <w:r>
+        <w:t>endmodule</w:t>
+      </w:r>
+    </w:p>
+    <w:p>
+      <w:pPr>
+        <w:pStyle w:val="ListParagraph"/>
+      </w:pPr>
+    </w:p>
+    <w:p>
+      <w:pPr>
+        <w:pStyle w:val="ListParagraph"/>
+      </w:pPr>
+    </w:p>
     <w:p/>
     <w:sectPr>
       <w:pgSz w:w="11906" w:h="16838"/>
@@ -102,6 +592,103 @@
     </w:sectPr>
   </w:body>
 </w:document>
+</file>
+
+<file path=word/numbering.xml><?xml version="1.0" encoding="utf-8"?>
+<w:numbering xmlns:wpc="http://schemas.microsoft.com/office/word/2010/wordprocessingCanvas" xmlns:cx="http://schemas.microsoft.com/office/drawing/2014/chartex" xmlns:cx1="http://schemas.microsoft.com/office/drawing/2015/9/8/chartex" xmlns:cx2="http://schemas.microsoft.com/office/drawing/2015/10/21/chartex" xmlns:cx3="http://schemas.microsoft.com/office/drawing/2016/5/9/chartex" xmlns:cx4="http://schemas.microsoft.com/office/drawing/2016/5/10/chartex" xmlns:cx5="http://schemas.microsoft.com/office/drawing/2016/5/11/chartex" xmlns:cx6="http://schemas.microsoft.com/office/drawing/2016/5/12/chartex" xmlns:cx7="http://schemas.microsoft.com/office/drawing/2016/5/13/chartex" xmlns:cx8="http://schemas.microsoft.com/office/drawing/2016/5/14/chartex" xmlns:mc="http://schemas.openxmlformats.org/markup-compatibility/2006" xmlns:aink="http://schemas.microsoft.com/office/drawing/2016/ink" xmlns:am3d="http://schemas.microsoft.com/office/drawing/2017/model3d" xmlns:o="urn:schemas-microsoft-com:office:office" xmlns:oel="http://schemas.microsoft.com/office/2019/extlst" xmlns:r="http://schemas.openxmlformats.org/officeDocument/2006/relationships" xmlns:m="http://schemas.openxmlformats.org/officeDocument/2006/math" xmlns:v="urn:schemas-microsoft-com:vml" xmlns:wp14="http://schemas.microsoft.com/office/word/2010/wordprocessingDrawing" xmlns:wp="http://schemas.openxmlformats.org/drawingml/2006/wordprocessingDrawing" xmlns:w10="urn:schemas-microsoft-com:office:word" xmlns:w="http://schemas.openxmlformats.org/wordprocessingml/2006/main" xmlns:w14="http://schemas.microsoft.com/office/word/2010/wordml" xmlns:w15="http://schemas.microsoft.com/office/word/2012/wordml" xmlns:w16cex="http://schemas.microsoft.com/office/word/2018/wordml/cex" xmlns:w16cid="http://schemas.microsoft.com/office/word/2016/wordml/cid" xmlns:w16="http://schemas.microsoft.com/office/word/2018/wordml" xmlns:w16du="http://schemas.microsoft.com/office/word/2023/wordml/word16du" xmlns:w16sdtdh="http://schemas.microsoft.com/office/word/2020/wordml/sdtdatahash" xmlns:w16sdtfl="http://schemas.microsoft.com/office/word/2024/wordml/sdtformatlock" xmlns:w16se="http://schemas.microsoft.com/office/word/2015/wordml/symex" xmlns:wpg="http://schemas.microsoft.com/office/word/2010/wordprocessingGroup" xmlns:wpi="http://schemas.microsoft.com/office/word/2010/wordprocessingInk" xmlns:wne="http://schemas.microsoft.com/office/word/2006/wordml" xmlns:wps="http://schemas.microsoft.com/office/word/2010/wordprocessingShape" mc:Ignorable="w14 w15 w16se w16cid w16 w16cex w16sdtdh w16sdtfl w16du wp14">
+  <w:abstractNum w:abstractNumId="0" w15:restartNumberingAfterBreak="0">
+    <w:nsid w:val="26EC5B7A"/>
+    <w:multiLevelType w:val="hybridMultilevel"/>
+    <w:tmpl w:val="4170C086"/>
+    <w:lvl w:ilvl="0" w:tplc="40090017">
+      <w:start w:val="1"/>
+      <w:numFmt w:val="lowerLetter"/>
+      <w:lvlText w:val="%1)"/>
+      <w:lvlJc w:val="left"/>
+      <w:pPr>
+        <w:ind w:left="720" w:hanging="360"/>
+      </w:pPr>
+      <w:rPr>
+        <w:rFonts w:hint="default"/>
+      </w:rPr>
+    </w:lvl>
+    <w:lvl w:ilvl="1" w:tplc="40090019" w:tentative="1">
+      <w:start w:val="1"/>
+      <w:numFmt w:val="lowerLetter"/>
+      <w:lvlText w:val="%2."/>
+      <w:lvlJc w:val="left"/>
+      <w:pPr>
+        <w:ind w:left="1440" w:hanging="360"/>
+      </w:pPr>
+    </w:lvl>
+    <w:lvl w:ilvl="2" w:tplc="4009001B" w:tentative="1">
+      <w:start w:val="1"/>
+      <w:numFmt w:val="lowerRoman"/>
+      <w:lvlText w:val="%3."/>
+      <w:lvlJc w:val="right"/>
+      <w:pPr>
+        <w:ind w:left="2160" w:hanging="180"/>
+      </w:pPr>
+    </w:lvl>
+    <w:lvl w:ilvl="3" w:tplc="4009000F" w:tentative="1">
+      <w:start w:val="1"/>
+      <w:numFmt w:val="decimal"/>
+      <w:lvlText w:val="%4."/>
+      <w:lvlJc w:val="left"/>
+      <w:pPr>
+        <w:ind w:left="2880" w:hanging="360"/>
+      </w:pPr>
+    </w:lvl>
+    <w:lvl w:ilvl="4" w:tplc="40090019" w:tentative="1">
+      <w:start w:val="1"/>
+      <w:numFmt w:val="lowerLetter"/>
+      <w:lvlText w:val="%5."/>
+      <w:lvlJc w:val="left"/>
+      <w:pPr>
+        <w:ind w:left="3600" w:hanging="360"/>
+      </w:pPr>
+    </w:lvl>
+    <w:lvl w:ilvl="5" w:tplc="4009001B" w:tentative="1">
+      <w:start w:val="1"/>
+      <w:numFmt w:val="lowerRoman"/>
+      <w:lvlText w:val="%6."/>
+      <w:lvlJc w:val="right"/>
+      <w:pPr>
+        <w:ind w:left="4320" w:hanging="180"/>
+      </w:pPr>
+    </w:lvl>
+    <w:lvl w:ilvl="6" w:tplc="4009000F" w:tentative="1">
+      <w:start w:val="1"/>
+      <w:numFmt w:val="decimal"/>
+      <w:lvlText w:val="%7."/>
+      <w:lvlJc w:val="left"/>
+      <w:pPr>
+        <w:ind w:left="5040" w:hanging="360"/>
+      </w:pPr>
+    </w:lvl>
+    <w:lvl w:ilvl="7" w:tplc="40090019" w:tentative="1">
+      <w:start w:val="1"/>
+      <w:numFmt w:val="lowerLetter"/>
+      <w:lvlText w:val="%8."/>
+      <w:lvlJc w:val="left"/>
+      <w:pPr>
+        <w:ind w:left="5760" w:hanging="360"/>
+      </w:pPr>
+    </w:lvl>
+    <w:lvl w:ilvl="8" w:tplc="4009001B" w:tentative="1">
+      <w:start w:val="1"/>
+      <w:numFmt w:val="lowerRoman"/>
+      <w:lvlText w:val="%9."/>
+      <w:lvlJc w:val="right"/>
+      <w:pPr>
+        <w:ind w:left="6480" w:hanging="180"/>
+      </w:pPr>
+    </w:lvl>
+  </w:abstractNum>
+  <w:num w:numId="1" w16cid:durableId="1931423013">
+    <w:abstractNumId w:val="0"/>
+  </w:num>
+</w:numbering>
 </file>
 
 <file path=word/styles.xml><?xml version="1.0" encoding="utf-8"?>
@@ -1020,6 +1607,29 @@
       <w:spacing w:val="5"/>
     </w:rPr>
   </w:style>
+  <w:style w:type="character" w:styleId="Hyperlink">
+    <w:name w:val="Hyperlink"/>
+    <w:basedOn w:val="DefaultParagraphFont"/>
+    <w:uiPriority w:val="99"/>
+    <w:unhideWhenUsed/>
+    <w:rsid w:val="00F84582"/>
+    <w:rPr>
+      <w:color w:val="0563C1" w:themeColor="hyperlink"/>
+      <w:u w:val="single"/>
+    </w:rPr>
+  </w:style>
+  <w:style w:type="character" w:styleId="UnresolvedMention">
+    <w:name w:val="Unresolved Mention"/>
+    <w:basedOn w:val="DefaultParagraphFont"/>
+    <w:uiPriority w:val="99"/>
+    <w:semiHidden/>
+    <w:unhideWhenUsed/>
+    <w:rsid w:val="00F84582"/>
+    <w:rPr>
+      <w:color w:val="605E5C"/>
+      <w:shd w:val="clear" w:color="auto" w:fill="E1DFDD"/>
+    </w:rPr>
+  </w:style>
 </w:styles>
 </file>
 

</xml_diff>

<commit_message>
Refresh Assignment 4 simulation evidence
Update Assignment 4 compiled simulation artifacts and VCD waveform captures after rerunning the behavioral, synchronous-reset, and asynchronous-reset counter testbenches.

Update the Assignment 4 submission document and add its PDF export, preserving the verified counter implementation and simulation evidence.
</commit_message>
<xml_diff>
--- a/DAY2/Assignment 4/Assignment 4.docx
+++ b/DAY2/Assignment 4/Assignment 4.docx
@@ -221,8 +221,211 @@
       </w:r>
     </w:p>
     <w:p/>
-    <w:p/>
-    <w:p/>
+    <w:p>
+      <w:pPr>
+        <w:rPr>
+          <w:b/>
+          <w:bCs/>
+        </w:rPr>
+      </w:pPr>
+      <w:r>
+        <w:rPr>
+          <w:b/>
+          <w:bCs/>
+        </w:rPr>
+        <w:t>Compilation :</w:t>
+      </w:r>
+    </w:p>
+    <w:p>
+      <w:pPr>
+        <w:rPr>
+          <w:b/>
+          <w:bCs/>
+        </w:rPr>
+      </w:pPr>
+      <w:r>
+        <w:rPr>
+          <w:b/>
+          <w:bCs/>
+        </w:rPr>
+        <w:drawing>
+          <wp:inline distT="0" distB="0" distL="0" distR="0" wp14:anchorId="228580BE" wp14:editId="3C368C4F">
+            <wp:extent cx="5731510" cy="3220085"/>
+            <wp:effectExtent l="0" t="0" r="2540" b="0"/>
+            <wp:docPr id="1398501267" name="Picture 1"/>
+            <wp:cNvGraphicFramePr>
+              <a:graphicFrameLocks xmlns:a="http://schemas.openxmlformats.org/drawingml/2006/main" noChangeAspect="1"/>
+            </wp:cNvGraphicFramePr>
+            <a:graphic xmlns:a="http://schemas.openxmlformats.org/drawingml/2006/main">
+              <a:graphicData uri="http://schemas.openxmlformats.org/drawingml/2006/picture">
+                <pic:pic xmlns:pic="http://schemas.openxmlformats.org/drawingml/2006/picture">
+                  <pic:nvPicPr>
+                    <pic:cNvPr id="1398501267" name=""/>
+                    <pic:cNvPicPr/>
+                  </pic:nvPicPr>
+                  <pic:blipFill>
+                    <a:blip r:embed="rId7"/>
+                    <a:stretch>
+                      <a:fillRect/>
+                    </a:stretch>
+                  </pic:blipFill>
+                  <pic:spPr>
+                    <a:xfrm>
+                      <a:off x="0" y="0"/>
+                      <a:ext cx="5731510" cy="3220085"/>
+                    </a:xfrm>
+                    <a:prstGeom prst="rect">
+                      <a:avLst/>
+                    </a:prstGeom>
+                  </pic:spPr>
+                </pic:pic>
+              </a:graphicData>
+            </a:graphic>
+          </wp:inline>
+        </w:drawing>
+      </w:r>
+    </w:p>
+    <w:p>
+      <w:pPr>
+        <w:rPr>
+          <w:b/>
+          <w:bCs/>
+        </w:rPr>
+      </w:pPr>
+    </w:p>
+    <w:p>
+      <w:pPr>
+        <w:rPr>
+          <w:b/>
+          <w:bCs/>
+        </w:rPr>
+      </w:pPr>
+      <w:r>
+        <w:rPr>
+          <w:b/>
+          <w:bCs/>
+        </w:rPr>
+        <w:drawing>
+          <wp:inline distT="0" distB="0" distL="0" distR="0" wp14:anchorId="27C45CA4" wp14:editId="046DA49B">
+            <wp:extent cx="5731510" cy="3220085"/>
+            <wp:effectExtent l="0" t="0" r="2540" b="0"/>
+            <wp:docPr id="182919302" name="Picture 1"/>
+            <wp:cNvGraphicFramePr>
+              <a:graphicFrameLocks xmlns:a="http://schemas.openxmlformats.org/drawingml/2006/main" noChangeAspect="1"/>
+            </wp:cNvGraphicFramePr>
+            <a:graphic xmlns:a="http://schemas.openxmlformats.org/drawingml/2006/main">
+              <a:graphicData uri="http://schemas.openxmlformats.org/drawingml/2006/picture">
+                <pic:pic xmlns:pic="http://schemas.openxmlformats.org/drawingml/2006/picture">
+                  <pic:nvPicPr>
+                    <pic:cNvPr id="182919302" name=""/>
+                    <pic:cNvPicPr/>
+                  </pic:nvPicPr>
+                  <pic:blipFill>
+                    <a:blip r:embed="rId8"/>
+                    <a:stretch>
+                      <a:fillRect/>
+                    </a:stretch>
+                  </pic:blipFill>
+                  <pic:spPr>
+                    <a:xfrm>
+                      <a:off x="0" y="0"/>
+                      <a:ext cx="5731510" cy="3220085"/>
+                    </a:xfrm>
+                    <a:prstGeom prst="rect">
+                      <a:avLst/>
+                    </a:prstGeom>
+                  </pic:spPr>
+                </pic:pic>
+              </a:graphicData>
+            </a:graphic>
+          </wp:inline>
+        </w:drawing>
+      </w:r>
+    </w:p>
+    <w:p>
+      <w:pPr>
+        <w:rPr>
+          <w:b/>
+          <w:bCs/>
+        </w:rPr>
+      </w:pPr>
+    </w:p>
+    <w:p>
+      <w:pPr>
+        <w:rPr>
+          <w:b/>
+          <w:bCs/>
+        </w:rPr>
+      </w:pPr>
+    </w:p>
+    <w:p>
+      <w:pPr>
+        <w:rPr>
+          <w:b/>
+          <w:bCs/>
+        </w:rPr>
+      </w:pPr>
+    </w:p>
+    <w:p>
+      <w:pPr>
+        <w:rPr>
+          <w:b/>
+          <w:bCs/>
+        </w:rPr>
+      </w:pPr>
+      <w:r>
+        <w:rPr>
+          <w:b/>
+          <w:bCs/>
+        </w:rPr>
+        <w:lastRenderedPageBreak/>
+        <w:t>Simulation :</w:t>
+      </w:r>
+    </w:p>
+    <w:p>
+      <w:r>
+        <w:t>Synchronous reset. In the next clk edge only the count increment is done and stuff.</w:t>
+      </w:r>
+    </w:p>
+    <w:p>
+      <w:r>
+        <w:drawing>
+          <wp:inline distT="0" distB="0" distL="0" distR="0" wp14:anchorId="7825FF19" wp14:editId="4B84F6F1">
+            <wp:extent cx="5731510" cy="3220085"/>
+            <wp:effectExtent l="0" t="0" r="2540" b="0"/>
+            <wp:docPr id="1384983575" name="Picture 1"/>
+            <wp:cNvGraphicFramePr>
+              <a:graphicFrameLocks xmlns:a="http://schemas.openxmlformats.org/drawingml/2006/main" noChangeAspect="1"/>
+            </wp:cNvGraphicFramePr>
+            <a:graphic xmlns:a="http://schemas.openxmlformats.org/drawingml/2006/main">
+              <a:graphicData uri="http://schemas.openxmlformats.org/drawingml/2006/picture">
+                <pic:pic xmlns:pic="http://schemas.openxmlformats.org/drawingml/2006/picture">
+                  <pic:nvPicPr>
+                    <pic:cNvPr id="1384983575" name=""/>
+                    <pic:cNvPicPr/>
+                  </pic:nvPicPr>
+                  <pic:blipFill>
+                    <a:blip r:embed="rId9"/>
+                    <a:stretch>
+                      <a:fillRect/>
+                    </a:stretch>
+                  </pic:blipFill>
+                  <pic:spPr>
+                    <a:xfrm>
+                      <a:off x="0" y="0"/>
+                      <a:ext cx="5731510" cy="3220085"/>
+                    </a:xfrm>
+                    <a:prstGeom prst="rect">
+                      <a:avLst/>
+                    </a:prstGeom>
+                  </pic:spPr>
+                </pic:pic>
+              </a:graphicData>
+            </a:graphic>
+          </wp:inline>
+        </w:drawing>
+      </w:r>
+    </w:p>
     <w:p/>
     <w:p>
       <w:pPr>
@@ -406,7 +609,201 @@
     <w:p>
       <w:pPr>
         <w:pStyle w:val="ListParagraph"/>
-      </w:pPr>
+        <w:rPr>
+          <w:b/>
+          <w:bCs/>
+        </w:rPr>
+      </w:pPr>
+      <w:r>
+        <w:rPr>
+          <w:b/>
+          <w:bCs/>
+        </w:rPr>
+        <w:lastRenderedPageBreak/>
+        <w:t xml:space="preserve">Compilation : </w:t>
+      </w:r>
+    </w:p>
+    <w:p>
+      <w:pPr>
+        <w:pStyle w:val="ListParagraph"/>
+        <w:rPr>
+          <w:b/>
+          <w:bCs/>
+        </w:rPr>
+      </w:pPr>
+      <w:r>
+        <w:rPr>
+          <w:b/>
+          <w:bCs/>
+        </w:rPr>
+        <w:drawing>
+          <wp:inline distT="0" distB="0" distL="0" distR="0" wp14:anchorId="6AED0DBB" wp14:editId="5AD499D8">
+            <wp:extent cx="5731510" cy="3220085"/>
+            <wp:effectExtent l="0" t="0" r="2540" b="0"/>
+            <wp:docPr id="251699634" name="Picture 1"/>
+            <wp:cNvGraphicFramePr>
+              <a:graphicFrameLocks xmlns:a="http://schemas.openxmlformats.org/drawingml/2006/main" noChangeAspect="1"/>
+            </wp:cNvGraphicFramePr>
+            <a:graphic xmlns:a="http://schemas.openxmlformats.org/drawingml/2006/main">
+              <a:graphicData uri="http://schemas.openxmlformats.org/drawingml/2006/picture">
+                <pic:pic xmlns:pic="http://schemas.openxmlformats.org/drawingml/2006/picture">
+                  <pic:nvPicPr>
+                    <pic:cNvPr id="251699634" name=""/>
+                    <pic:cNvPicPr/>
+                  </pic:nvPicPr>
+                  <pic:blipFill>
+                    <a:blip r:embed="rId10"/>
+                    <a:stretch>
+                      <a:fillRect/>
+                    </a:stretch>
+                  </pic:blipFill>
+                  <pic:spPr>
+                    <a:xfrm>
+                      <a:off x="0" y="0"/>
+                      <a:ext cx="5731510" cy="3220085"/>
+                    </a:xfrm>
+                    <a:prstGeom prst="rect">
+                      <a:avLst/>
+                    </a:prstGeom>
+                  </pic:spPr>
+                </pic:pic>
+              </a:graphicData>
+            </a:graphic>
+          </wp:inline>
+        </w:drawing>
+      </w:r>
+    </w:p>
+    <w:p>
+      <w:pPr>
+        <w:pStyle w:val="ListParagraph"/>
+        <w:rPr>
+          <w:b/>
+          <w:bCs/>
+        </w:rPr>
+      </w:pPr>
+    </w:p>
+    <w:p>
+      <w:pPr>
+        <w:pStyle w:val="ListParagraph"/>
+        <w:rPr>
+          <w:b/>
+          <w:bCs/>
+        </w:rPr>
+      </w:pPr>
+      <w:r>
+        <w:rPr>
+          <w:b/>
+          <w:bCs/>
+        </w:rPr>
+        <w:drawing>
+          <wp:inline distT="0" distB="0" distL="0" distR="0" wp14:anchorId="01E981FB" wp14:editId="5078958A">
+            <wp:extent cx="5731510" cy="3220085"/>
+            <wp:effectExtent l="0" t="0" r="2540" b="0"/>
+            <wp:docPr id="1706688719" name="Picture 1"/>
+            <wp:cNvGraphicFramePr>
+              <a:graphicFrameLocks xmlns:a="http://schemas.openxmlformats.org/drawingml/2006/main" noChangeAspect="1"/>
+            </wp:cNvGraphicFramePr>
+            <a:graphic xmlns:a="http://schemas.openxmlformats.org/drawingml/2006/main">
+              <a:graphicData uri="http://schemas.openxmlformats.org/drawingml/2006/picture">
+                <pic:pic xmlns:pic="http://schemas.openxmlformats.org/drawingml/2006/picture">
+                  <pic:nvPicPr>
+                    <pic:cNvPr id="1706688719" name=""/>
+                    <pic:cNvPicPr/>
+                  </pic:nvPicPr>
+                  <pic:blipFill>
+                    <a:blip r:embed="rId11"/>
+                    <a:stretch>
+                      <a:fillRect/>
+                    </a:stretch>
+                  </pic:blipFill>
+                  <pic:spPr>
+                    <a:xfrm>
+                      <a:off x="0" y="0"/>
+                      <a:ext cx="5731510" cy="3220085"/>
+                    </a:xfrm>
+                    <a:prstGeom prst="rect">
+                      <a:avLst/>
+                    </a:prstGeom>
+                  </pic:spPr>
+                </pic:pic>
+              </a:graphicData>
+            </a:graphic>
+          </wp:inline>
+        </w:drawing>
+      </w:r>
+    </w:p>
+    <w:p>
+      <w:pPr>
+        <w:pStyle w:val="ListParagraph"/>
+        <w:rPr>
+          <w:b/>
+          <w:bCs/>
+        </w:rPr>
+      </w:pPr>
+    </w:p>
+    <w:p>
+      <w:pPr>
+        <w:pStyle w:val="ListParagraph"/>
+        <w:rPr>
+          <w:b/>
+          <w:bCs/>
+        </w:rPr>
+      </w:pPr>
+      <w:r>
+        <w:rPr>
+          <w:b/>
+          <w:bCs/>
+        </w:rPr>
+        <w:t xml:space="preserve">Simulation : </w:t>
+      </w:r>
+    </w:p>
+    <w:p>
+      <w:pPr>
+        <w:pStyle w:val="ListParagraph"/>
+      </w:pPr>
+    </w:p>
+    <w:p>
+      <w:pPr>
+        <w:pStyle w:val="ListParagraph"/>
+      </w:pPr>
+      <w:r>
+        <w:lastRenderedPageBreak/>
+        <w:drawing>
+          <wp:inline distT="0" distB="0" distL="0" distR="0" wp14:anchorId="26F6D400" wp14:editId="3577BA0A">
+            <wp:extent cx="5731510" cy="3220085"/>
+            <wp:effectExtent l="0" t="0" r="2540" b="0"/>
+            <wp:docPr id="597784242" name="Picture 1"/>
+            <wp:cNvGraphicFramePr>
+              <a:graphicFrameLocks xmlns:a="http://schemas.openxmlformats.org/drawingml/2006/main" noChangeAspect="1"/>
+            </wp:cNvGraphicFramePr>
+            <a:graphic xmlns:a="http://schemas.openxmlformats.org/drawingml/2006/main">
+              <a:graphicData uri="http://schemas.openxmlformats.org/drawingml/2006/picture">
+                <pic:pic xmlns:pic="http://schemas.openxmlformats.org/drawingml/2006/picture">
+                  <pic:nvPicPr>
+                    <pic:cNvPr id="597784242" name=""/>
+                    <pic:cNvPicPr/>
+                  </pic:nvPicPr>
+                  <pic:blipFill>
+                    <a:blip r:embed="rId12"/>
+                    <a:stretch>
+                      <a:fillRect/>
+                    </a:stretch>
+                  </pic:blipFill>
+                  <pic:spPr>
+                    <a:xfrm>
+                      <a:off x="0" y="0"/>
+                      <a:ext cx="5731510" cy="3220085"/>
+                    </a:xfrm>
+                    <a:prstGeom prst="rect">
+                      <a:avLst/>
+                    </a:prstGeom>
+                  </pic:spPr>
+                </pic:pic>
+              </a:graphicData>
+            </a:graphic>
+          </wp:inline>
+        </w:drawing>
+      </w:r>
     </w:p>
     <w:p>
       <w:pPr>
@@ -521,61 +918,400 @@
         <w:pStyle w:val="ListParagraph"/>
       </w:pPr>
       <w:r>
+        <w:t xml:space="preserve">            count &lt;= 4'b0000;</w:t>
+      </w:r>
+    </w:p>
+    <w:p>
+      <w:pPr>
+        <w:pStyle w:val="ListParagraph"/>
+      </w:pPr>
+      <w:r>
+        <w:t xml:space="preserve">        else if (up)</w:t>
+      </w:r>
+    </w:p>
+    <w:p>
+      <w:pPr>
+        <w:pStyle w:val="ListParagraph"/>
+      </w:pPr>
+      <w:r>
+        <w:t xml:space="preserve">            count &lt;= count + 4'b0001;</w:t>
+      </w:r>
+    </w:p>
+    <w:p>
+      <w:pPr>
+        <w:pStyle w:val="ListParagraph"/>
+      </w:pPr>
+      <w:r>
+        <w:t xml:space="preserve">        else</w:t>
+      </w:r>
+    </w:p>
+    <w:p>
+      <w:pPr>
+        <w:pStyle w:val="ListParagraph"/>
+      </w:pPr>
+      <w:r>
+        <w:t xml:space="preserve">            count &lt;= count - 4'b0001;</w:t>
+      </w:r>
+    </w:p>
+    <w:p>
+      <w:pPr>
+        <w:pStyle w:val="ListParagraph"/>
+      </w:pPr>
+      <w:r>
+        <w:t xml:space="preserve">    end</w:t>
+      </w:r>
+    </w:p>
+    <w:p>
+      <w:pPr>
+        <w:pStyle w:val="ListParagraph"/>
+      </w:pPr>
+      <w:r>
+        <w:t>endmodule</w:t>
+      </w:r>
+    </w:p>
+    <w:p>
+      <w:pPr>
+        <w:pStyle w:val="ListParagraph"/>
+      </w:pPr>
+    </w:p>
+    <w:p>
+      <w:pPr>
+        <w:pStyle w:val="ListParagraph"/>
+        <w:rPr>
+          <w:b/>
+          <w:bCs/>
+        </w:rPr>
+      </w:pPr>
+    </w:p>
+    <w:p>
+      <w:pPr>
+        <w:pStyle w:val="ListParagraph"/>
+        <w:rPr>
+          <w:b/>
+          <w:bCs/>
+        </w:rPr>
+      </w:pPr>
+    </w:p>
+    <w:p>
+      <w:pPr>
+        <w:pStyle w:val="ListParagraph"/>
+        <w:rPr>
+          <w:b/>
+          <w:bCs/>
+        </w:rPr>
+      </w:pPr>
+    </w:p>
+    <w:p>
+      <w:pPr>
+        <w:pStyle w:val="ListParagraph"/>
+        <w:rPr>
+          <w:b/>
+          <w:bCs/>
+        </w:rPr>
+      </w:pPr>
+    </w:p>
+    <w:p>
+      <w:pPr>
+        <w:pStyle w:val="ListParagraph"/>
+        <w:rPr>
+          <w:b/>
+          <w:bCs/>
+        </w:rPr>
+      </w:pPr>
+    </w:p>
+    <w:p>
+      <w:pPr>
+        <w:pStyle w:val="ListParagraph"/>
+        <w:rPr>
+          <w:b/>
+          <w:bCs/>
+        </w:rPr>
+      </w:pPr>
+    </w:p>
+    <w:p>
+      <w:pPr>
+        <w:pStyle w:val="ListParagraph"/>
+        <w:rPr>
+          <w:b/>
+          <w:bCs/>
+        </w:rPr>
+      </w:pPr>
+    </w:p>
+    <w:p>
+      <w:pPr>
+        <w:pStyle w:val="ListParagraph"/>
+        <w:rPr>
+          <w:b/>
+          <w:bCs/>
+        </w:rPr>
+      </w:pPr>
+      <w:r>
+        <w:rPr>
+          <w:b/>
+          <w:bCs/>
+        </w:rPr>
         <w:lastRenderedPageBreak/>
-        <w:t xml:space="preserve">            count &lt;= 4'b0000;</w:t>
-      </w:r>
-    </w:p>
-    <w:p>
-      <w:pPr>
-        <w:pStyle w:val="ListParagraph"/>
-      </w:pPr>
-      <w:r>
-        <w:t xml:space="preserve">        else if (up)</w:t>
-      </w:r>
-    </w:p>
-    <w:p>
-      <w:pPr>
-        <w:pStyle w:val="ListParagraph"/>
-      </w:pPr>
-      <w:r>
-        <w:t xml:space="preserve">            count &lt;= count + 4'b0001;</w:t>
-      </w:r>
-    </w:p>
-    <w:p>
-      <w:pPr>
-        <w:pStyle w:val="ListParagraph"/>
-      </w:pPr>
-      <w:r>
-        <w:t xml:space="preserve">        else</w:t>
-      </w:r>
-    </w:p>
-    <w:p>
-      <w:pPr>
-        <w:pStyle w:val="ListParagraph"/>
-      </w:pPr>
-      <w:r>
-        <w:t xml:space="preserve">            count &lt;= count - 4'b0001;</w:t>
-      </w:r>
-    </w:p>
-    <w:p>
-      <w:pPr>
-        <w:pStyle w:val="ListParagraph"/>
-      </w:pPr>
-      <w:r>
-        <w:t xml:space="preserve">    end</w:t>
-      </w:r>
-    </w:p>
-    <w:p>
-      <w:pPr>
-        <w:pStyle w:val="ListParagraph"/>
-      </w:pPr>
-      <w:r>
-        <w:t>endmodule</w:t>
-      </w:r>
-    </w:p>
-    <w:p>
-      <w:pPr>
-        <w:pStyle w:val="ListParagraph"/>
+        <w:t xml:space="preserve">Compilation : </w:t>
+      </w:r>
+    </w:p>
+    <w:p>
+      <w:pPr>
+        <w:pStyle w:val="ListParagraph"/>
+      </w:pPr>
+      <w:r>
+        <w:drawing>
+          <wp:inline distT="0" distB="0" distL="0" distR="0" wp14:anchorId="212D36F3" wp14:editId="2AC342D3">
+            <wp:extent cx="5731510" cy="3220085"/>
+            <wp:effectExtent l="0" t="0" r="2540" b="0"/>
+            <wp:docPr id="975125879" name="Picture 1"/>
+            <wp:cNvGraphicFramePr>
+              <a:graphicFrameLocks xmlns:a="http://schemas.openxmlformats.org/drawingml/2006/main" noChangeAspect="1"/>
+            </wp:cNvGraphicFramePr>
+            <a:graphic xmlns:a="http://schemas.openxmlformats.org/drawingml/2006/main">
+              <a:graphicData uri="http://schemas.openxmlformats.org/drawingml/2006/picture">
+                <pic:pic xmlns:pic="http://schemas.openxmlformats.org/drawingml/2006/picture">
+                  <pic:nvPicPr>
+                    <pic:cNvPr id="975125879" name=""/>
+                    <pic:cNvPicPr/>
+                  </pic:nvPicPr>
+                  <pic:blipFill>
+                    <a:blip r:embed="rId13"/>
+                    <a:stretch>
+                      <a:fillRect/>
+                    </a:stretch>
+                  </pic:blipFill>
+                  <pic:spPr>
+                    <a:xfrm>
+                      <a:off x="0" y="0"/>
+                      <a:ext cx="5731510" cy="3220085"/>
+                    </a:xfrm>
+                    <a:prstGeom prst="rect">
+                      <a:avLst/>
+                    </a:prstGeom>
+                  </pic:spPr>
+                </pic:pic>
+              </a:graphicData>
+            </a:graphic>
+          </wp:inline>
+        </w:drawing>
+      </w:r>
+    </w:p>
+    <w:p>
+      <w:pPr>
+        <w:pStyle w:val="ListParagraph"/>
+      </w:pPr>
+    </w:p>
+    <w:p>
+      <w:pPr>
+        <w:pStyle w:val="ListParagraph"/>
+      </w:pPr>
+      <w:r>
+        <w:drawing>
+          <wp:inline distT="0" distB="0" distL="0" distR="0" wp14:anchorId="6C2092A2" wp14:editId="75FF08C3">
+            <wp:extent cx="5731510" cy="3220085"/>
+            <wp:effectExtent l="0" t="0" r="2540" b="0"/>
+            <wp:docPr id="513807850" name="Picture 1"/>
+            <wp:cNvGraphicFramePr>
+              <a:graphicFrameLocks xmlns:a="http://schemas.openxmlformats.org/drawingml/2006/main" noChangeAspect="1"/>
+            </wp:cNvGraphicFramePr>
+            <a:graphic xmlns:a="http://schemas.openxmlformats.org/drawingml/2006/main">
+              <a:graphicData uri="http://schemas.openxmlformats.org/drawingml/2006/picture">
+                <pic:pic xmlns:pic="http://schemas.openxmlformats.org/drawingml/2006/picture">
+                  <pic:nvPicPr>
+                    <pic:cNvPr id="513807850" name=""/>
+                    <pic:cNvPicPr/>
+                  </pic:nvPicPr>
+                  <pic:blipFill>
+                    <a:blip r:embed="rId14"/>
+                    <a:stretch>
+                      <a:fillRect/>
+                    </a:stretch>
+                  </pic:blipFill>
+                  <pic:spPr>
+                    <a:xfrm>
+                      <a:off x="0" y="0"/>
+                      <a:ext cx="5731510" cy="3220085"/>
+                    </a:xfrm>
+                    <a:prstGeom prst="rect">
+                      <a:avLst/>
+                    </a:prstGeom>
+                  </pic:spPr>
+                </pic:pic>
+              </a:graphicData>
+            </a:graphic>
+          </wp:inline>
+        </w:drawing>
+      </w:r>
+    </w:p>
+    <w:p>
+      <w:pPr>
+        <w:pStyle w:val="ListParagraph"/>
+      </w:pPr>
+    </w:p>
+    <w:p>
+      <w:pPr>
+        <w:pStyle w:val="ListParagraph"/>
+        <w:rPr>
+          <w:b/>
+          <w:bCs/>
+        </w:rPr>
+      </w:pPr>
+    </w:p>
+    <w:p>
+      <w:pPr>
+        <w:pStyle w:val="ListParagraph"/>
+        <w:rPr>
+          <w:b/>
+          <w:bCs/>
+        </w:rPr>
+      </w:pPr>
+    </w:p>
+    <w:p>
+      <w:pPr>
+        <w:pStyle w:val="ListParagraph"/>
+        <w:rPr>
+          <w:b/>
+          <w:bCs/>
+        </w:rPr>
+      </w:pPr>
+    </w:p>
+    <w:p>
+      <w:pPr>
+        <w:pStyle w:val="ListParagraph"/>
+        <w:rPr>
+          <w:b/>
+          <w:bCs/>
+        </w:rPr>
+      </w:pPr>
+    </w:p>
+    <w:p>
+      <w:pPr>
+        <w:pStyle w:val="ListParagraph"/>
+        <w:rPr>
+          <w:b/>
+          <w:bCs/>
+        </w:rPr>
+      </w:pPr>
+    </w:p>
+    <w:p>
+      <w:pPr>
+        <w:pStyle w:val="ListParagraph"/>
+        <w:rPr>
+          <w:b/>
+          <w:bCs/>
+        </w:rPr>
+      </w:pPr>
+    </w:p>
+    <w:p>
+      <w:pPr>
+        <w:pStyle w:val="ListParagraph"/>
+        <w:rPr>
+          <w:b/>
+          <w:bCs/>
+        </w:rPr>
+      </w:pPr>
+    </w:p>
+    <w:p>
+      <w:pPr>
+        <w:pStyle w:val="ListParagraph"/>
+        <w:rPr>
+          <w:b/>
+          <w:bCs/>
+        </w:rPr>
+      </w:pPr>
+    </w:p>
+    <w:p>
+      <w:pPr>
+        <w:pStyle w:val="ListParagraph"/>
+        <w:rPr>
+          <w:b/>
+          <w:bCs/>
+        </w:rPr>
+      </w:pPr>
+      <w:r>
+        <w:rPr>
+          <w:b/>
+          <w:bCs/>
+        </w:rPr>
+        <w:lastRenderedPageBreak/>
+        <w:t xml:space="preserve">Simulation : </w:t>
+      </w:r>
+    </w:p>
+    <w:p>
+      <w:pPr>
+        <w:pStyle w:val="ListParagraph"/>
+        <w:rPr>
+          <w:b/>
+          <w:bCs/>
+        </w:rPr>
+      </w:pPr>
+    </w:p>
+    <w:p>
+      <w:pPr>
+        <w:pStyle w:val="ListParagraph"/>
+        <w:rPr>
+          <w:b/>
+          <w:bCs/>
+        </w:rPr>
+      </w:pPr>
+      <w:r>
+        <w:rPr>
+          <w:b/>
+          <w:bCs/>
+        </w:rPr>
+        <w:drawing>
+          <wp:inline distT="0" distB="0" distL="0" distR="0" wp14:anchorId="7A11449C" wp14:editId="14914827">
+            <wp:extent cx="5731510" cy="3220085"/>
+            <wp:effectExtent l="0" t="0" r="2540" b="0"/>
+            <wp:docPr id="640831259" name="Picture 1"/>
+            <wp:cNvGraphicFramePr>
+              <a:graphicFrameLocks xmlns:a="http://schemas.openxmlformats.org/drawingml/2006/main" noChangeAspect="1"/>
+            </wp:cNvGraphicFramePr>
+            <a:graphic xmlns:a="http://schemas.openxmlformats.org/drawingml/2006/main">
+              <a:graphicData uri="http://schemas.openxmlformats.org/drawingml/2006/picture">
+                <pic:pic xmlns:pic="http://schemas.openxmlformats.org/drawingml/2006/picture">
+                  <pic:nvPicPr>
+                    <pic:cNvPr id="640831259" name=""/>
+                    <pic:cNvPicPr/>
+                  </pic:nvPicPr>
+                  <pic:blipFill>
+                    <a:blip r:embed="rId15"/>
+                    <a:stretch>
+                      <a:fillRect/>
+                    </a:stretch>
+                  </pic:blipFill>
+                  <pic:spPr>
+                    <a:xfrm>
+                      <a:off x="0" y="0"/>
+                      <a:ext cx="5731510" cy="3220085"/>
+                    </a:xfrm>
+                    <a:prstGeom prst="rect">
+                      <a:avLst/>
+                    </a:prstGeom>
+                  </pic:spPr>
+                </pic:pic>
+              </a:graphicData>
+            </a:graphic>
+          </wp:inline>
+        </w:drawing>
+      </w:r>
+    </w:p>
+    <w:p>
+      <w:pPr>
+        <w:pStyle w:val="ListParagraph"/>
+        <w:rPr>
+          <w:b/>
+          <w:bCs/>
+        </w:rPr>
+      </w:pPr>
+    </w:p>
+    <w:p>
+      <w:pPr>
+        <w:pStyle w:val="ListParagraph"/>
+        <w:rPr>
+          <w:b/>
+          <w:bCs/>
+        </w:rPr>
       </w:pPr>
     </w:p>
     <w:p>

</xml_diff>